<commit_message>
Prepare SSD Manager legal website
</commit_message>
<xml_diff>
--- a/docs/legal-release-package/word/00_SSD_Manager_Dokumentenregister.docx
+++ b/docs/legal-release-package/word/00_SSD_Manager_Dokumentenregister.docx
@@ -358,7 +358,7 @@
           </w:tcPr>
           <w:p>
             <w:r>
-              <w:t>Preis/Laufzeit und Recht prüfen</w:t>
+              <w:t>Individuelle Konditionen ergänzen und Recht prüfen</w:t>
             </w:r>
           </w:p>
         </w:tc>
@@ -969,7 +969,7 @@
         <w:ind w:left="720" w:hanging="360"/>
       </w:pPr>
       <w:r>
-        <w:t>Pilot- und Rechnungsvorlagen, bis Vertriebsmodell und Preis ausdrücklich festgelegt sind.</w:t>
+        <w:t>Standardisierte Preis-, Laufzeit- und Pilotvorgaben; diese werden mit jeder Schule beziehungsweise jedem Schulträger individuell vereinbart.</w:t>
       </w:r>
     </w:p>
     <w:p>
@@ -1045,7 +1045,7 @@
         <w:ind w:left="720" w:hanging="360"/>
       </w:pPr>
       <w:r>
-        <w:t>MinutMate-Anbieterangaben, Steuerstatus, Leistungs-/Preismodell und URLs bestätigen.</w:t>
+        <w:t>MinutMate-Anbieterangaben, Steuerstatus und öffentliche Produkt-URLs sind dokumentiert; kommerzielle Konditionen werden je Schule individuell vereinbart.</w:t>
       </w:r>
     </w:p>
     <w:p>

</xml_diff>